<commit_message>
28/12/2025 - 16:50 h
</commit_message>
<xml_diff>
--- a/O mandamento maior/O Mandamento Maior - Versão sem Caridade com os Criminosos.docx
+++ b/O mandamento maior/O Mandamento Maior - Versão sem Caridade com os Criminosos.docx
@@ -1597,314 +1597,40 @@
         </w:rPr>
       </w:pPr>
       <w:r>
-        <w:rPr>
-          <w:color w:val="000000"/>
-        </w:rPr>
-      </w:r>
-    </w:p>
-    <w:p>
-      <w:pPr>
-        <w:pStyle w:val="Normal"/>
-        <w:jc w:val="both"/>
-        <w:rPr>
-          <w:color w:val="000000"/>
-        </w:rPr>
-      </w:pPr>
-      <w:r>
-        <w:rPr>
-          <w:rFonts w:eastAsia="Times New Roman" w:cs="Times New Roman" w:ascii="Garamond" w:hAnsi="Garamond"/>
-          <w:color w:val="000000"/>
-          <w:kern w:val="0"/>
-          <w:sz w:val="36"/>
-          <w:szCs w:val="36"/>
-          <w:shd w:fill="auto" w:val="clear"/>
-          <w:lang w:val="en-US" w:eastAsia="zh-CN" w:bidi="hi-IN"/>
-        </w:rPr>
-        <w:t xml:space="preserve">Então, dado que nós nos encontramos hoje encarnados, nós </w:t>
-      </w:r>
-      <w:r>
-        <w:rPr>
-          <w:rFonts w:eastAsia="Times New Roman" w:cs="Times New Roman" w:ascii="Garamond" w:hAnsi="Garamond"/>
-          <w:color w:val="000000"/>
-          <w:kern w:val="0"/>
-          <w:sz w:val="36"/>
-          <w:szCs w:val="36"/>
-          <w:shd w:fill="FFFF00" w:val="clear"/>
-          <w:lang w:val="en-US" w:eastAsia="zh-CN" w:bidi="hi-IN"/>
-        </w:rPr>
-        <w:t>somos almas</w:t>
-      </w:r>
-      <w:r>
-        <w:rPr>
-          <w:rFonts w:eastAsia="Times New Roman" w:cs="Times New Roman" w:ascii="Garamond" w:hAnsi="Garamond"/>
-          <w:color w:val="000000"/>
-          <w:kern w:val="0"/>
-          <w:sz w:val="36"/>
-          <w:szCs w:val="36"/>
-          <w:shd w:fill="auto" w:val="clear"/>
-          <w:lang w:val="en-US" w:eastAsia="zh-CN" w:bidi="hi-IN"/>
-        </w:rPr>
-        <w:t>. Não é "nós temos alma", viu?</w:t>
-      </w:r>
-    </w:p>
-    <w:p>
-      <w:pPr>
-        <w:pStyle w:val="Normal"/>
-        <w:jc w:val="both"/>
-        <w:rPr>
-          <w:color w:val="000000"/>
-        </w:rPr>
-      </w:pPr>
-      <w:r>
-        <w:rPr>
-          <w:color w:val="000000"/>
-        </w:rPr>
-      </w:r>
-    </w:p>
-    <w:p>
-      <w:pPr>
-        <w:pStyle w:val="Normal"/>
-        <w:jc w:val="both"/>
-        <w:rPr>
-          <w:color w:val="000000"/>
-        </w:rPr>
-      </w:pPr>
-      <w:r>
-        <w:rPr>
-          <w:rFonts w:eastAsia="Times New Roman" w:cs="Times New Roman" w:ascii="Garamond" w:hAnsi="Garamond"/>
-          <w:color w:val="000000"/>
-          <w:kern w:val="0"/>
-          <w:sz w:val="36"/>
-          <w:szCs w:val="36"/>
-          <w:shd w:fill="auto" w:val="clear"/>
-          <w:lang w:val="en-US" w:eastAsia="zh-CN" w:bidi="hi-IN"/>
-        </w:rPr>
-        <w:t xml:space="preserve">Aliás, já repararam como nós temos uma enorme dificuldade de nos reconhecermos como seres espirituais? Nós ainda nos identificamos </w:t>
-      </w:r>
-      <w:r>
-        <w:rPr>
-          <w:rFonts w:eastAsia="Times New Roman" w:cs="Times New Roman" w:ascii="Garamond" w:hAnsi="Garamond"/>
-          <w:color w:val="000000"/>
-          <w:kern w:val="0"/>
-          <w:sz w:val="36"/>
-          <w:szCs w:val="36"/>
-          <w:shd w:fill="FFFF00" w:val="clear"/>
-          <w:lang w:val="en-US" w:eastAsia="zh-CN" w:bidi="hi-IN"/>
-        </w:rPr>
-        <w:t>como se fôssemos seres materiais que possuem Espírito</w:t>
-      </w:r>
-      <w:r>
-        <w:rPr>
-          <w:rFonts w:eastAsia="Times New Roman" w:cs="Times New Roman" w:ascii="Garamond" w:hAnsi="Garamond"/>
-          <w:color w:val="000000"/>
-          <w:kern w:val="0"/>
-          <w:sz w:val="36"/>
-          <w:szCs w:val="36"/>
-          <w:shd w:fill="auto" w:val="clear"/>
-          <w:lang w:val="en-US" w:eastAsia="zh-CN" w:bidi="hi-IN"/>
-        </w:rPr>
-        <w:t>.</w:t>
-      </w:r>
-    </w:p>
-    <w:p>
-      <w:pPr>
-        <w:pStyle w:val="Normal"/>
-        <w:jc w:val="both"/>
-        <w:rPr>
-          <w:color w:val="000000"/>
-        </w:rPr>
-      </w:pPr>
-      <w:r>
-        <w:rPr>
-          <w:color w:val="000000"/>
-        </w:rPr>
-      </w:r>
-    </w:p>
-    <w:p>
-      <w:pPr>
-        <w:pStyle w:val="Normal"/>
-        <w:jc w:val="both"/>
-        <w:rPr>
-          <w:color w:val="000000"/>
-        </w:rPr>
-      </w:pPr>
-      <w:r>
-        <w:rPr>
-          <w:rFonts w:eastAsia="Times New Roman" w:cs="Times New Roman" w:ascii="Garamond" w:hAnsi="Garamond"/>
-          <w:color w:val="000000"/>
-          <w:kern w:val="0"/>
-          <w:sz w:val="36"/>
-          <w:szCs w:val="36"/>
-          <w:shd w:fill="auto" w:val="clear"/>
-          <w:lang w:val="en-US" w:eastAsia="zh-CN" w:bidi="hi-IN"/>
-        </w:rPr>
-        <w:t xml:space="preserve">Por isso falamos "meu Espírito", "nossos Espíritos", "o Espírito dele". Nós não temos Espírito; nós somos Espíritos. E enquanto encarnados, possuimos temporariamente uma </w:t>
-      </w:r>
-      <w:r>
-        <w:rPr>
-          <w:rFonts w:eastAsia="Times New Roman" w:cs="Times New Roman" w:ascii="Garamond" w:hAnsi="Garamond"/>
-          <w:color w:val="000000"/>
-          <w:kern w:val="0"/>
-          <w:sz w:val="36"/>
-          <w:szCs w:val="36"/>
-          <w:shd w:fill="FFFF00" w:val="clear"/>
-          <w:lang w:val="en-US" w:eastAsia="zh-CN" w:bidi="hi-IN"/>
-        </w:rPr>
-        <w:t>aparelhagem física</w:t>
-      </w:r>
-      <w:r>
-        <w:rPr>
-          <w:rFonts w:eastAsia="Times New Roman" w:cs="Times New Roman" w:ascii="Garamond" w:hAnsi="Garamond"/>
-          <w:color w:val="000000"/>
-          <w:kern w:val="0"/>
-          <w:sz w:val="36"/>
-          <w:szCs w:val="36"/>
-          <w:shd w:fill="auto" w:val="clear"/>
-          <w:lang w:val="en-US" w:eastAsia="zh-CN" w:bidi="hi-IN"/>
-        </w:rPr>
-        <w:t xml:space="preserve"> que nos serve de </w:t>
-      </w:r>
-      <w:r>
-        <w:rPr>
-          <w:rFonts w:eastAsia="Times New Roman" w:cs="Times New Roman" w:ascii="Garamond" w:hAnsi="Garamond"/>
-          <w:color w:val="000000"/>
-          <w:kern w:val="0"/>
-          <w:sz w:val="36"/>
-          <w:szCs w:val="36"/>
-          <w:shd w:fill="FFFF00" w:val="clear"/>
-          <w:lang w:val="en-US" w:eastAsia="zh-CN" w:bidi="hi-IN"/>
-        </w:rPr>
-        <w:t>instrumento de trabalho e evolução</w:t>
-      </w:r>
-      <w:r>
-        <w:rPr>
-          <w:rFonts w:eastAsia="Times New Roman" w:cs="Times New Roman" w:ascii="Garamond" w:hAnsi="Garamond"/>
-          <w:color w:val="000000"/>
-          <w:kern w:val="0"/>
-          <w:sz w:val="36"/>
-          <w:szCs w:val="36"/>
-          <w:shd w:fill="auto" w:val="clear"/>
-          <w:lang w:val="en-US" w:eastAsia="zh-CN" w:bidi="hi-IN"/>
-        </w:rPr>
-        <w:t>.</w:t>
-      </w:r>
-    </w:p>
-    <w:p>
-      <w:pPr>
-        <w:pStyle w:val="Normal"/>
-        <w:jc w:val="both"/>
-        <w:rPr>
-          <w:color w:val="000000"/>
-        </w:rPr>
-      </w:pPr>
-      <w:r>
-        <w:rPr>
-          <w:color w:val="000000"/>
-        </w:rPr>
-      </w:r>
-    </w:p>
-    <w:p>
-      <w:pPr>
-        <w:pStyle w:val="Normal"/>
-        <w:jc w:val="both"/>
-        <w:rPr>
-          <w:color w:val="000000"/>
-        </w:rPr>
-      </w:pPr>
-      <w:r>
-        <w:rPr>
-          <w:rFonts w:eastAsia="Times New Roman" w:cs="Times New Roman" w:ascii="Garamond" w:hAnsi="Garamond"/>
-          <w:color w:val="000000"/>
-          <w:kern w:val="0"/>
-          <w:sz w:val="36"/>
-          <w:szCs w:val="36"/>
-          <w:shd w:fill="auto" w:val="clear"/>
-          <w:lang w:val="en-US" w:eastAsia="zh-CN" w:bidi="hi-IN"/>
-        </w:rPr>
-        <w:t xml:space="preserve">Meu objetivo aqui </w:t>
-      </w:r>
-      <w:r>
-        <w:rPr>
-          <w:rFonts w:eastAsia="Times New Roman" w:cs="Times New Roman" w:ascii="Garamond" w:hAnsi="Garamond"/>
-          <w:color w:val="000000"/>
-          <w:kern w:val="0"/>
-          <w:sz w:val="36"/>
-          <w:szCs w:val="36"/>
-          <w:shd w:fill="FFFF00" w:val="clear"/>
-          <w:lang w:val="en-US" w:eastAsia="zh-CN" w:bidi="hi-IN"/>
-        </w:rPr>
-        <w:t>não é criticar</w:t>
-      </w:r>
-      <w:r>
-        <w:rPr>
-          <w:rFonts w:eastAsia="Times New Roman" w:cs="Times New Roman" w:ascii="Garamond" w:hAnsi="Garamond"/>
-          <w:color w:val="000000"/>
-          <w:kern w:val="0"/>
-          <w:sz w:val="36"/>
-          <w:szCs w:val="36"/>
-          <w:shd w:fill="auto" w:val="clear"/>
-          <w:lang w:val="en-US" w:eastAsia="zh-CN" w:bidi="hi-IN"/>
-        </w:rPr>
-        <w:t xml:space="preserve"> quem fala "meu Espírito". Na verdade eu mesmo falo assim às vezes, embora eu tente me policiar para não falar. Eu só trouxe esse ponto para mostrar o quanto </w:t>
-      </w:r>
-      <w:r>
-        <w:rPr>
-          <w:rFonts w:eastAsia="Times New Roman" w:cs="Times New Roman" w:ascii="Garamond" w:hAnsi="Garamond"/>
-          <w:color w:val="000000"/>
-          <w:kern w:val="0"/>
-          <w:sz w:val="36"/>
-          <w:szCs w:val="36"/>
-          <w:shd w:fill="FFFF00" w:val="clear"/>
-          <w:lang w:val="en-US" w:eastAsia="zh-CN" w:bidi="hi-IN"/>
-        </w:rPr>
-        <w:t>nos vemos mais como seres materiais que espirituais</w:t>
-      </w:r>
-      <w:r>
-        <w:rPr>
-          <w:rFonts w:eastAsia="Times New Roman" w:cs="Times New Roman" w:ascii="Garamond" w:hAnsi="Garamond"/>
-          <w:color w:val="000000"/>
-          <w:kern w:val="0"/>
-          <w:sz w:val="36"/>
-          <w:szCs w:val="36"/>
-          <w:shd w:fill="auto" w:val="clear"/>
-          <w:lang w:val="en-US" w:eastAsia="zh-CN" w:bidi="hi-IN"/>
-        </w:rPr>
-        <w:t>.</w:t>
-      </w:r>
-    </w:p>
-    <w:p>
-      <w:pPr>
-        <w:pStyle w:val="Normal"/>
-        <w:jc w:val="both"/>
-        <w:rPr>
-          <w:color w:val="000000"/>
-        </w:rPr>
-      </w:pPr>
-      <w:r>
-        <w:rPr>
-          <w:color w:val="000000"/>
-        </w:rPr>
-      </w:r>
-    </w:p>
-    <w:p>
-      <w:pPr>
-        <w:pStyle w:val="Normal"/>
-        <w:jc w:val="both"/>
-        <w:rPr>
-          <w:color w:val="000000"/>
-        </w:rPr>
-      </w:pPr>
-      <w:r>
-        <w:rPr>
-          <w:rFonts w:eastAsia="Times New Roman" w:cs="Times New Roman" w:ascii="Garamond" w:hAnsi="Garamond"/>
-          <w:color w:val="000000"/>
-          <w:kern w:val="0"/>
-          <w:sz w:val="36"/>
-          <w:szCs w:val="36"/>
-          <w:shd w:fill="auto" w:val="clear"/>
-          <w:lang w:val="en-US" w:eastAsia="zh-CN" w:bidi="hi-IN"/>
-        </w:rPr>
-        <w:t xml:space="preserve">Voltando à nossa análise, amar a Deus de toda a alma  é amar na </w:t>
+        <w:rPr/>
+      </w:r>
+    </w:p>
+    <w:p>
+      <w:pPr>
+        <w:pStyle w:val="Normal"/>
+        <w:jc w:val="both"/>
+        <w:rPr>
+          <w:color w:val="000000"/>
+        </w:rPr>
+      </w:pPr>
+      <w:r>
+        <w:rPr>
+          <w:rFonts w:eastAsia="Times New Roman" w:cs="Times New Roman" w:ascii="Garamond" w:hAnsi="Garamond"/>
+          <w:color w:val="000000"/>
+          <w:kern w:val="0"/>
+          <w:sz w:val="36"/>
+          <w:szCs w:val="36"/>
+          <w:shd w:fill="auto" w:val="clear"/>
+          <w:lang w:val="en-US" w:eastAsia="zh-CN" w:bidi="hi-IN"/>
+        </w:rPr>
+        <w:t>Amar</w:t>
+      </w:r>
+      <w:r>
+        <w:rPr>
+          <w:rFonts w:eastAsia="Times New Roman" w:cs="Times New Roman" w:ascii="Garamond" w:hAnsi="Garamond"/>
+          <w:color w:val="000000"/>
+          <w:kern w:val="0"/>
+          <w:sz w:val="36"/>
+          <w:szCs w:val="36"/>
+          <w:shd w:fill="auto" w:val="clear"/>
+          <w:lang w:val="en-US" w:eastAsia="zh-CN" w:bidi="hi-IN"/>
+        </w:rPr>
+        <w:t xml:space="preserve"> a Deus de toda a alma  é amar na </w:t>
       </w:r>
       <w:r>
         <w:rPr>
@@ -7089,43 +6815,36 @@
       </w:pPr>
       <w:r>
         <w:rPr>
-          <w:sz w:val="36"/>
-          <w:szCs w:val="36"/>
-        </w:rPr>
-      </w:r>
-    </w:p>
-    <w:p>
-      <w:pPr>
-        <w:pStyle w:val="Normal"/>
-        <w:jc w:val="both"/>
-        <w:rPr>
-          <w:sz w:val="36"/>
-          <w:szCs w:val="36"/>
-        </w:rPr>
-      </w:pPr>
-      <w:r>
-        <w:rPr>
-          <w:rFonts w:eastAsia="Times New Roman" w:cs="Times New Roman" w:ascii="Garamond" w:hAnsi="Garamond"/>
-          <w:color w:val="000000"/>
-          <w:kern w:val="0"/>
-          <w:sz w:val="36"/>
-          <w:szCs w:val="36"/>
-          <w:shd w:fill="auto" w:val="clear"/>
-          <w:lang w:val="en-US" w:eastAsia="zh-CN" w:bidi="hi-IN"/>
-        </w:rPr>
-        <w:t>Para</w:t>
-      </w:r>
-      <w:r>
-        <w:rPr>
-          <w:rFonts w:eastAsia="Times New Roman" w:cs="Times New Roman" w:ascii="Garamond" w:hAnsi="Garamond"/>
-          <w:color w:val="000000"/>
-          <w:kern w:val="0"/>
-          <w:sz w:val="36"/>
-          <w:szCs w:val="36"/>
-          <w:shd w:fill="auto" w:val="clear"/>
-          <w:lang w:val="en-US" w:eastAsia="zh-CN" w:bidi="hi-IN"/>
-        </w:rPr>
-        <w:t xml:space="preserve"> encerrarmos o tema amor ao próximo: sem querer traçar qualquer </w:t>
+          <w:rFonts w:eastAsia="Times New Roman" w:cs="Times New Roman" w:ascii="Garamond" w:hAnsi="Garamond"/>
+          <w:color w:val="000000"/>
+          <w:kern w:val="0"/>
+          <w:sz w:val="36"/>
+          <w:szCs w:val="36"/>
+          <w:shd w:fill="auto" w:val="clear"/>
+          <w:lang w:val="en-US" w:eastAsia="zh-CN" w:bidi="hi-IN"/>
+        </w:rPr>
+      </w:r>
+    </w:p>
+    <w:p>
+      <w:pPr>
+        <w:pStyle w:val="Normal"/>
+        <w:jc w:val="both"/>
+        <w:rPr>
+          <w:sz w:val="36"/>
+          <w:szCs w:val="36"/>
+        </w:rPr>
+      </w:pPr>
+      <w:r>
+        <w:rPr>
+          <w:rFonts w:eastAsia="Times New Roman" w:cs="Times New Roman" w:ascii="Garamond" w:hAnsi="Garamond"/>
+          <w:color w:val="000000"/>
+          <w:kern w:val="0"/>
+          <w:sz w:val="36"/>
+          <w:szCs w:val="36"/>
+          <w:shd w:fill="auto" w:val="clear"/>
+          <w:lang w:val="en-US" w:eastAsia="zh-CN" w:bidi="hi-IN"/>
+        </w:rPr>
+        <w:t xml:space="preserve">Para encerrarmos o tema amor ao próximo: sem querer traçar qualquer </w:t>
       </w:r>
       <w:r>
         <w:rPr>
@@ -8281,7 +8000,15 @@
         </w:rPr>
       </w:pPr>
       <w:r>
-        <w:rPr/>
+        <w:rPr>
+          <w:rFonts w:eastAsia="Times New Roman" w:cs="Times New Roman" w:ascii="Garamond" w:hAnsi="Garamond"/>
+          <w:color w:val="000000"/>
+          <w:kern w:val="0"/>
+          <w:sz w:val="36"/>
+          <w:szCs w:val="36"/>
+          <w:shd w:fill="auto" w:val="clear"/>
+          <w:lang w:val="en-US" w:eastAsia="zh-CN" w:bidi="hi-IN"/>
+        </w:rPr>
       </w:r>
       <w:r>
         <w:br w:type="page"/>
@@ -9741,31 +9468,7 @@
           <w:shd w:fill="auto" w:val="clear"/>
           <w:lang w:val="en-US" w:eastAsia="zh-CN" w:bidi="hi-IN"/>
         </w:rPr>
-        <w:t xml:space="preserve">Kardec </w:t>
-      </w:r>
-      <w:r>
-        <w:rPr>
-          <w:rFonts w:eastAsia="Times New Roman" w:cs="Times New Roman" w:ascii="Garamond" w:hAnsi="Garamond"/>
-          <w:color w:val="000000"/>
-          <w:kern w:val="0"/>
-          <w:sz w:val="36"/>
-          <w:szCs w:val="36"/>
-          <w:shd w:fill="auto" w:val="clear"/>
-          <w:lang w:val="en-US" w:eastAsia="zh-CN" w:bidi="hi-IN"/>
-        </w:rPr>
-        <w:t>nos fala</w:t>
-      </w:r>
-      <w:r>
-        <w:rPr>
-          <w:rFonts w:eastAsia="Times New Roman" w:cs="Times New Roman" w:ascii="Garamond" w:hAnsi="Garamond"/>
-          <w:color w:val="000000"/>
-          <w:kern w:val="0"/>
-          <w:sz w:val="36"/>
-          <w:szCs w:val="36"/>
-          <w:shd w:fill="auto" w:val="clear"/>
-          <w:lang w:val="en-US" w:eastAsia="zh-CN" w:bidi="hi-IN"/>
-        </w:rPr>
-        <w:t xml:space="preserve"> que quando a humanidade recebe </w:t>
+        <w:t xml:space="preserve">Kardec nos fala que quando a humanidade recebe </w:t>
       </w:r>
       <w:r>
         <w:rPr>
@@ -12545,31 +12248,7 @@
           <w:shd w:fill="auto" w:val="clear"/>
           <w:lang w:val="en-US" w:eastAsia="zh-CN" w:bidi="hi-IN"/>
         </w:rPr>
-        <w:t xml:space="preserve">Ou seguimos </w:t>
-      </w:r>
-      <w:r>
-        <w:rPr>
-          <w:rFonts w:eastAsia="Times New Roman" w:cs="Times New Roman" w:ascii="Garamond" w:hAnsi="Garamond"/>
-          <w:color w:val="000000"/>
-          <w:kern w:val="0"/>
-          <w:sz w:val="36"/>
-          <w:szCs w:val="36"/>
-          <w:shd w:fill="auto" w:val="clear"/>
-          <w:lang w:val="en-US" w:eastAsia="zh-CN" w:bidi="hi-IN"/>
-        </w:rPr>
-        <w:t xml:space="preserve">determinados, </w:t>
-      </w:r>
-      <w:r>
-        <w:rPr>
-          <w:rFonts w:eastAsia="Times New Roman" w:cs="Times New Roman" w:ascii="Garamond" w:hAnsi="Garamond"/>
-          <w:color w:val="000000"/>
-          <w:kern w:val="0"/>
-          <w:sz w:val="36"/>
-          <w:szCs w:val="36"/>
-          <w:shd w:fill="auto" w:val="clear"/>
-          <w:lang w:val="en-US" w:eastAsia="zh-CN" w:bidi="hi-IN"/>
-        </w:rPr>
-        <w:t>fazendo</w:t>
+        <w:t>Ou seguimos determinados, fazendo</w:t>
       </w:r>
       <w:r>
         <w:rPr>
@@ -12724,7 +12403,7 @@
         <w:bCs/>
         <w:rFonts w:ascii="Garamond" w:hAnsi="Garamond"/>
       </w:rPr>
-      <w:t>28</w:t>
+      <w:t>29</w:t>
     </w:r>
     <w:r>
       <w:rPr>

</xml_diff>